<commit_message>
Letters: As-Is House, Estate Attorney and Estate PR letters use (980) 990-2356 like the others
Co-Authored-By: Claude Opus 5.5 <noreply@anthropic.com>
Claude-Session: https://claude.ai/code/session_01BamT8tWdcZjqPnQGE7uRYt
</commit_message>
<xml_diff>
--- a/mail-templates/As-Is House Letter (Blessings).docx
+++ b/mail-templates/As-Is House Letter (Blessings).docx
@@ -36,7 +36,7 @@
           <w:rFonts w:ascii="Patrick Hand" w:hAnsi="Patrick Hand" w:cs="Patrick Hand" w:eastAsia="Patrick Hand"/>
           <w:sz w:val="30"/>
         </w:rPr>
-        <w:t>(704) 387-3482  |  damien@dominionlandgroup.land</w:t>
+        <w:t>(980) 990-2356  |  damien@dominionlandgroup.land</w:t>
       </w:r>
     </w:p>
     <w:p>
@@ -189,7 +189,7 @@
           <w:rFonts w:ascii="Patrick Hand" w:hAnsi="Patrick Hand" w:cs="Patrick Hand" w:eastAsia="Patrick Hand"/>
           <w:sz w:val="30"/>
         </w:rPr>
-        <w:t xml:space="preserve">If you'd like to talk, call or text me at (704) 387-3482, or email damien@dominionlandgroup.land, and mention offer code </w:t>
+        <w:t xml:space="preserve">If you'd like to talk, call or text me at (980) 990-2356, or email damien@dominionlandgroup.land, and mention offer code </w:t>
       </w:r>
       <w:r>
         <w:rPr>

</xml_diff>

<commit_message>
Letters: As-Is House, Estate Attorney and Estate PR letters use (980) 990-2356 like the others (#62)
Claude-Session: https://claude.ai/code/session_01BamT8tWdcZjqPnQGE7uRYt

Co-authored-by: Claude <noreply@anthropic.com>
</commit_message>
<xml_diff>
--- a/mail-templates/As-Is House Letter (Blessings).docx
+++ b/mail-templates/As-Is House Letter (Blessings).docx
@@ -36,7 +36,7 @@
           <w:rFonts w:ascii="Patrick Hand" w:hAnsi="Patrick Hand" w:cs="Patrick Hand" w:eastAsia="Patrick Hand"/>
           <w:sz w:val="30"/>
         </w:rPr>
-        <w:t>(704) 387-3482  |  damien@dominionlandgroup.land</w:t>
+        <w:t>(980) 990-2356  |  damien@dominionlandgroup.land</w:t>
       </w:r>
     </w:p>
     <w:p>
@@ -189,7 +189,7 @@
           <w:rFonts w:ascii="Patrick Hand" w:hAnsi="Patrick Hand" w:cs="Patrick Hand" w:eastAsia="Patrick Hand"/>
           <w:sz w:val="30"/>
         </w:rPr>
-        <w:t xml:space="preserve">If you'd like to talk, call or text me at (704) 387-3482, or email damien@dominionlandgroup.land, and mention offer code </w:t>
+        <w:t xml:space="preserve">If you'd like to talk, call or text me at (980) 990-2356, or email damien@dominionlandgroup.land, and mention offer code </w:t>
       </w:r>
       <w:r>
         <w:rPr>

</xml_diff>